<commit_message>
Numbers test: review passed (3 of 4 reviewers ready, no blocking issues); minor fixes; second dry run passed
Pins the word values and all six markups to the verified fingerprints, keeps
--report-only from overwriting results, adds a words-only column and clearer
warnings. The frozen design and pre-registration are unchanged.

Co-Authored-By: Claude Opus 5.5 <noreply@anthropic.com>
Claude-Session: https://claude.ai/code/session_01VCh7XeJpj5JpCzQtSzh7gK
</commit_message>
<xml_diff>
--- a/NUMBERS_TEST_2026-10-21/00_START_HERE_Numbers_Test.docx
+++ b/NUMBERS_TEST_2026-10-21/00_START_HERE_Numbers_Test.docx
@@ -75,7 +75,7 @@
         <w:rPr>
           <w:b/>
         </w:rPr>
-        <w:t>Status: running.</w:t>
+        <w:t>Status: the review passed and the full run (18 models, about 4-5 hours) started on 21 October.</w:t>
       </w:r>
       <w:r>
         <w:t xml:space="preserve"> This guide is updated at each step.</w:t>
@@ -587,6 +587,130 @@
       </w:r>
     </w:p>
     <w:p>
+      <w:r>
+        <w:t xml:space="preserve">6. </w:t>
+      </w:r>
+      <w:r>
+        <w:rPr>
+          <w:b/>
+        </w:rPr>
+        <w:t>21 October: independent review.</w:t>
+      </w:r>
+      <w:r>
+        <w:t xml:space="preserve"> Four reviewers each checked the script from one angle: the rule's arithmetic, how markers are scored, the statistics against the pre-registration, and run safety. The session hit its usage limit twice, so this ran in pieces (02:20-02:40, 13:10-13:30 and 17:40 UTC).</w:t>
+      </w:r>
+    </w:p>
+    <w:p>
+      <w:pPr>
+        <w:pStyle w:val="ListBullet2"/>
+      </w:pPr>
+      <w:r>
+        <w:rPr>
+          <w:b/>
+        </w:rPr>
+        <w:t>Three reviewers finished: all "ready", no blocking problems,</w:t>
+      </w:r>
+      <w:r>
+        <w:t xml:space="preserve"> 12 minor notes.</w:t>
+      </w:r>
+    </w:p>
+    <w:p>
+      <w:pPr>
+        <w:pStyle w:val="ListBullet2"/>
+      </w:pPr>
+      <w:r>
+        <w:t>The fourth (run safety) was cut off twice; its checks were done directly at 17:40 UTC instead.</w:t>
+      </w:r>
+    </w:p>
+    <w:p>
+      <w:pPr>
+        <w:pStyle w:val="ListBullet2"/>
+      </w:pPr>
+      <w:r>
+        <w:t xml:space="preserve">Every finding and what was done about it is in </w:t>
+      </w:r>
+      <w:r>
+        <w:rPr>
+          <w:rFonts w:ascii="Courier New" w:hAnsi="Courier New"/>
+        </w:rPr>
+        <w:t>review/review_findings_and_fixes.md</w:t>
+      </w:r>
+      <w:r>
+        <w:t>.</w:t>
+      </w:r>
+    </w:p>
+    <w:p>
+      <w:r>
+        <w:t xml:space="preserve">7. </w:t>
+      </w:r>
+      <w:r>
+        <w:rPr>
+          <w:b/>
+        </w:rPr>
+        <w:t>Small fixes, no change to the frozen design:</w:t>
+      </w:r>
+    </w:p>
+    <w:p>
+      <w:pPr>
+        <w:pStyle w:val="ListBullet2"/>
+      </w:pPr>
+      <w:r>
+        <w:t>the inputs are pinned (the run refuses to start if the word values or any of the six markings differ from the verified versions);</w:t>
+      </w:r>
+    </w:p>
+    <w:p>
+      <w:pPr>
+        <w:pStyle w:val="ListBullet2"/>
+      </w:pPr>
+      <w:r>
+        <w:t>a provisional report can no longer overwrite the results;</w:t>
+      </w:r>
+    </w:p>
+    <w:p>
+      <w:pPr>
+        <w:pStyle w:val="ListBullet2"/>
+      </w:pPr>
+      <w:r>
+        <w:t>the report gains a words-only column and clearer warnings;</w:t>
+      </w:r>
+    </w:p>
+    <w:p>
+      <w:pPr>
+        <w:pStyle w:val="ListBullet2"/>
+      </w:pPr>
+      <w:r>
+        <w:t>two cosmetic display fixes.</w:t>
+      </w:r>
+    </w:p>
+    <w:p>
+      <w:r>
+        <w:t xml:space="preserve">8. </w:t>
+      </w:r>
+      <w:r>
+        <w:rPr>
+          <w:b/>
+        </w:rPr>
+        <w:t>Second dry run after the fixes (17:40 UTC): passed.</w:t>
+      </w:r>
+      <w:r>
+        <w:t xml:space="preserve"> Fingerprints of the repository before and after showed nothing changed.</w:t>
+      </w:r>
+    </w:p>
+    <w:p>
+      <w:r>
+        <w:t xml:space="preserve">9. </w:t>
+      </w:r>
+      <w:r>
+        <w:rPr>
+          <w:b/>
+        </w:rPr>
+        <w:t>Full run started</w:t>
+      </w:r>
+      <w:r>
+        <w:t xml:space="preserve"> (18 models). It saves and pushes partial results every 10 minutes.</w:t>
+      </w:r>
+    </w:p>
+    <w:p>
       <w:pPr>
         <w:pStyle w:val="Heading2"/>
       </w:pPr>
@@ -644,7 +768,7 @@
         <w:t>The drain (14.1% per valued word)</w:t>
       </w:r>
       <w:r>
-        <w:t xml:space="preserve"> was the AI's choice, not the owner's. It was set so that the owner's plain rule settles at exactly W = 17 + 4 = 21 in ordinary text, leaving 4. That is what keeps the word from getting stuck at the top, which is why the recharge was switched off before.</w:t>
+        <w:t xml:space="preserve"> was the AI's choice, not the owner's. It was set so that, for a verse with the average number of valued words (10.9), the owner's plain rule settles at exactly W = 17 + 4 = 21, leaving 4. Real verses vary (0 to 40 valued words), so across real neutral text it settles a little higher, near 22.4, leaving about 5.4 (a reviewer's correction). That drain is what keeps the word from getting stuck at the top, which is why the recharge was switched off before.</w:t>
       </w:r>
     </w:p>
     <w:p>
@@ -1016,6 +1140,276 @@
           </w:p>
         </w:tc>
       </w:tr>
+      <w:tr>
+        <w:tc>
+          <w:tcPr>
+            <w:tcW w:type="dxa" w:w="2880"/>
+          </w:tcPr>
+          <w:p>
+            <w:r>
+              <w:rPr>
+                <w:rFonts w:ascii="Courier New" w:hAnsi="Courier New"/>
+              </w:rPr>
+              <w:t>dry_run/dry_run_log.txt</w:t>
+            </w:r>
+            <w:r>
+              <w:t xml:space="preserve">, </w:t>
+            </w:r>
+            <w:r>
+              <w:rPr>
+                <w:rFonts w:ascii="Courier New" w:hAnsi="Courier New"/>
+              </w:rPr>
+              <w:t>results_numbers_dry.txt</w:t>
+            </w:r>
+            <w:r>
+              <w:t xml:space="preserve">, </w:t>
+            </w:r>
+            <w:r>
+              <w:rPr>
+                <w:rFonts w:ascii="Courier New" w:hAnsi="Courier New"/>
+              </w:rPr>
+              <w:t>.json</w:t>
+            </w:r>
+          </w:p>
+        </w:tc>
+        <w:tc>
+          <w:tcPr>
+            <w:tcW w:type="dxa" w:w="2880"/>
+          </w:tcPr>
+          <w:p>
+            <w:r>
+              <w:t>The first dry run (21 Oct 02:06 UTC): log, printed tables and every number. Dry-run numbers mean nothing; they check the machinery</w:t>
+            </w:r>
+          </w:p>
+        </w:tc>
+        <w:tc>
+          <w:tcPr>
+            <w:tcW w:type="dxa" w:w="2880"/>
+          </w:tcPr>
+          <w:p>
+            <w:r>
+              <w:t>made in this session; only here</w:t>
+            </w:r>
+          </w:p>
+        </w:tc>
+      </w:tr>
+      <w:tr>
+        <w:tc>
+          <w:tcPr>
+            <w:tcW w:type="dxa" w:w="2880"/>
+          </w:tcPr>
+          <w:p>
+            <w:r>
+              <w:rPr>
+                <w:rFonts w:ascii="Courier New" w:hAnsi="Courier New"/>
+              </w:rPr>
+              <w:t>dry_run/second_dry_run_after_fixes_*.txt</w:t>
+            </w:r>
+            <w:r>
+              <w:t xml:space="preserve">, </w:t>
+            </w:r>
+            <w:r>
+              <w:rPr>
+                <w:rFonts w:ascii="Courier New" w:hAnsi="Courier New"/>
+              </w:rPr>
+              <w:t>second_dry_run_results.txt</w:t>
+            </w:r>
+          </w:p>
+        </w:tc>
+        <w:tc>
+          <w:tcPr>
+            <w:tcW w:type="dxa" w:w="2880"/>
+          </w:tcPr>
+          <w:p>
+            <w:r>
+              <w:t>The second dry run after the review fixes (17:40 UTC), and the provisional-report test</w:t>
+            </w:r>
+          </w:p>
+        </w:tc>
+        <w:tc>
+          <w:tcPr>
+            <w:tcW w:type="dxa" w:w="2880"/>
+          </w:tcPr>
+          <w:p>
+            <w:r>
+              <w:t>made in this session; only here</w:t>
+            </w:r>
+          </w:p>
+        </w:tc>
+      </w:tr>
+      <w:tr>
+        <w:tc>
+          <w:tcPr>
+            <w:tcW w:type="dxa" w:w="2880"/>
+          </w:tcPr>
+          <w:p>
+            <w:r>
+              <w:rPr>
+                <w:rFonts w:ascii="Courier New" w:hAnsi="Courier New"/>
+              </w:rPr>
+              <w:t>review/review_findings_and_fixes.md</w:t>
+            </w:r>
+          </w:p>
+        </w:tc>
+        <w:tc>
+          <w:tcPr>
+            <w:tcW w:type="dxa" w:w="2880"/>
+          </w:tcPr>
+          <w:p>
+            <w:r>
+              <w:t>Every reviewer finding, what was done about each, and the checks each reviewer ran</w:t>
+            </w:r>
+          </w:p>
+        </w:tc>
+        <w:tc>
+          <w:tcPr>
+            <w:tcW w:type="dxa" w:w="2880"/>
+          </w:tcPr>
+          <w:p>
+            <w:r>
+              <w:t>made in this session; only here</w:t>
+            </w:r>
+          </w:p>
+        </w:tc>
+      </w:tr>
+      <w:tr>
+        <w:tc>
+          <w:tcPr>
+            <w:tcW w:type="dxa" w:w="2880"/>
+          </w:tcPr>
+          <w:p>
+            <w:r>
+              <w:rPr>
+                <w:rFonts w:ascii="Courier New" w:hAnsi="Courier New"/>
+              </w:rPr>
+              <w:t>code/run_full.sh</w:t>
+            </w:r>
+            <w:r>
+              <w:t xml:space="preserve">, </w:t>
+            </w:r>
+            <w:r>
+              <w:rPr>
+                <w:rFonts w:ascii="Courier New" w:hAnsi="Courier New"/>
+              </w:rPr>
+              <w:t>code/autosave.sh</w:t>
+            </w:r>
+          </w:p>
+        </w:tc>
+        <w:tc>
+          <w:tcPr>
+            <w:tcW w:type="dxa" w:w="2880"/>
+          </w:tcPr>
+          <w:p>
+            <w:r>
+              <w:t>Start the full run in the background; save and push partial results every 10 minutes</w:t>
+            </w:r>
+          </w:p>
+        </w:tc>
+        <w:tc>
+          <w:tcPr>
+            <w:tcW w:type="dxa" w:w="2880"/>
+          </w:tcPr>
+          <w:p>
+            <w:r>
+              <w:t>made in this session; only here</w:t>
+            </w:r>
+          </w:p>
+        </w:tc>
+      </w:tr>
+      <w:tr>
+        <w:tc>
+          <w:tcPr>
+            <w:tcW w:type="dxa" w:w="2880"/>
+          </w:tcPr>
+          <w:p>
+            <w:r>
+              <w:rPr>
+                <w:rFonts w:ascii="Courier New" w:hAnsi="Courier New"/>
+              </w:rPr>
+              <w:t>logs/full_run_log.txt</w:t>
+            </w:r>
+          </w:p>
+        </w:tc>
+        <w:tc>
+          <w:tcPr>
+            <w:tcW w:type="dxa" w:w="2880"/>
+          </w:tcPr>
+          <w:p>
+            <w:r>
+              <w:t>The full run's log, growing as it runs</w:t>
+            </w:r>
+          </w:p>
+        </w:tc>
+        <w:tc>
+          <w:tcPr>
+            <w:tcW w:type="dxa" w:w="2880"/>
+          </w:tcPr>
+          <w:p>
+            <w:r>
+              <w:t>made by the run; only here</w:t>
+            </w:r>
+          </w:p>
+        </w:tc>
+      </w:tr>
+      <w:tr>
+        <w:tc>
+          <w:tcPr>
+            <w:tcW w:type="dxa" w:w="2880"/>
+          </w:tcPr>
+          <w:p>
+            <w:r>
+              <w:rPr>
+                <w:rFonts w:ascii="Courier New" w:hAnsi="Courier New"/>
+              </w:rPr>
+              <w:t>results/results_numbers.json</w:t>
+            </w:r>
+            <w:r>
+              <w:t xml:space="preserve">, </w:t>
+            </w:r>
+            <w:r>
+              <w:rPr>
+                <w:rFonts w:ascii="Courier New" w:hAnsi="Courier New"/>
+              </w:rPr>
+              <w:t>.txt</w:t>
+            </w:r>
+          </w:p>
+        </w:tc>
+        <w:tc>
+          <w:tcPr>
+            <w:tcW w:type="dxa" w:w="2880"/>
+          </w:tcPr>
+          <w:p>
+            <w:r>
+              <w:t>Copies of the results (partial until the run ends)</w:t>
+            </w:r>
+          </w:p>
+        </w:tc>
+        <w:tc>
+          <w:tcPr>
+            <w:tcW w:type="dxa" w:w="2880"/>
+          </w:tcPr>
+          <w:p>
+            <w:r>
+              <w:rPr>
+                <w:rFonts w:ascii="Courier New" w:hAnsi="Courier New"/>
+              </w:rPr>
+              <w:t>experiments/results_numbers.json</w:t>
+            </w:r>
+            <w:r>
+              <w:t xml:space="preserve"> and </w:t>
+            </w:r>
+            <w:r>
+              <w:rPr>
+                <w:rFonts w:ascii="Courier New" w:hAnsi="Courier New"/>
+              </w:rPr>
+              <w:t>.txt</w:t>
+            </w:r>
+            <w:r>
+              <w:t xml:space="preserve"> (same branch)</w:t>
+            </w:r>
+          </w:p>
+        </w:tc>
+      </w:tr>
     </w:tbl>
     <w:p/>
     <w:p>

</xml_diff>